<commit_message>
Reframe Axsona role around market entry and GTM engineering
Replace first-weeks activity with the scope of the role: end-to-end
UAE/Middle East entry, AI-automated outbound, direct and partner
routes to market, and the regional sales operating rhythm.

Co-Authored-By: Claude Opus 5.5 <noreply@anthropic.com>
Claude-Session: https://claude.ai/code/session_01JCrzMJoLnbHnn3YThRBUsm
</commit_message>
<xml_diff>
--- a/Kasib/Kasib_Cassim_CV_Harvard.docx
+++ b/Kasib/Kasib_Cassim_CV_Harvard.docx
@@ -42,7 +42,7 @@
         </w:rPr>
         <w:t xml:space="preserve">  •  </w:t>
       </w:r>
-      <w:hyperlink w:history="1" r:id="rIdfej4qgihiz_biujoc8rd-">
+      <w:hyperlink w:history="1" r:id="rIdxjaw9cwf7y93dlcb7xfsy">
         <w:r>
           <w:rPr>
             <w:rFonts w:ascii="Times New Roman" w:cs="Times New Roman" w:eastAsia="Times New Roman" w:hAnsi="Times New Roman"/>
@@ -79,7 +79,7 @@
         <w:spacing w:after="40"/>
         <w:jc w:val="center"/>
       </w:pPr>
-      <w:hyperlink w:history="1" r:id="rIdiwcoeq8ua4ytcp8bxushb">
+      <w:hyperlink w:history="1" r:id="rIdoodsgfp2354khexmsno_f">
         <w:r>
           <w:rPr>
             <w:rFonts w:ascii="Times New Roman" w:cs="Times New Roman" w:eastAsia="Times New Roman" w:hAnsi="Times New Roman"/>
@@ -361,83 +361,83 @@
           <w:sz w:val="21"/>
           <w:szCs w:val="21"/>
         </w:rPr>
-        <w:t xml:space="preserve">Lead UAE market entry for Axsona, an AI platform that tests AI agents, products and messaging on synthetic populations of AI personas before launch.</w:t>
-      </w:r>
-    </w:p>
-    <w:p>
-      <w:pPr>
-        <w:pStyle w:val="ListParagraph"/>
-        <w:numPr>
-          <w:ilvl w:val="0"/>
-          <w:numId w:val="2"/>
-        </w:numPr>
-        <w:spacing w:after="10" w:line="245"/>
-      </w:pPr>
-      <w:r>
-        <w:rPr>
-          <w:rFonts w:ascii="Times New Roman" w:cs="Times New Roman" w:eastAsia="Times New Roman" w:hAnsi="Times New Roman"/>
-          <w:color w:val="000000"/>
-          <w:sz w:val="21"/>
-          <w:szCs w:val="21"/>
-        </w:rPr>
-        <w:t xml:space="preserve">Generated 7 qualified enterprise and partner leads in one week at Ai Everything Abu Dhabi, including a national telecom group and a global SaaS vendor, at VP and C-level.</w:t>
-      </w:r>
-    </w:p>
-    <w:p>
-      <w:pPr>
-        <w:pStyle w:val="ListParagraph"/>
-        <w:numPr>
-          <w:ilvl w:val="0"/>
-          <w:numId w:val="2"/>
-        </w:numPr>
-        <w:spacing w:after="10" w:line="245"/>
-      </w:pPr>
-      <w:r>
-        <w:rPr>
-          <w:rFonts w:ascii="Times New Roman" w:cs="Times New Roman" w:eastAsia="Times New Roman" w:hAnsi="Times New Roman"/>
-          <w:color w:val="000000"/>
-          <w:sz w:val="21"/>
-          <w:szCs w:val="21"/>
-        </w:rPr>
-        <w:t xml:space="preserve">Wrote 7 account-specific partnership proposals and outreach sequences, mapping use cases to each buyer’s priorities (AI agent trust, campaign pre-testing, regulatory impact, user adoption).</w:t>
-      </w:r>
-    </w:p>
-    <w:p>
-      <w:pPr>
-        <w:pStyle w:val="ListParagraph"/>
-        <w:numPr>
-          <w:ilvl w:val="0"/>
-          <w:numId w:val="2"/>
-        </w:numPr>
-        <w:spacing w:after="10" w:line="245"/>
-      </w:pPr>
-      <w:r>
-        <w:rPr>
-          <w:rFonts w:ascii="Times New Roman" w:cs="Times New Roman" w:eastAsia="Times New Roman" w:hAnsi="Times New Roman"/>
-          <w:color w:val="000000"/>
-          <w:sz w:val="21"/>
-          <w:szCs w:val="21"/>
-        </w:rPr>
-        <w:t xml:space="preserve">Designed the regional outbound playbook: a three-lane LinkedIn strategy (partners, direct buyers, warm network) across ~70 target accounts in banking, telecom, fintech, aviation, retail and real estate.</w:t>
-      </w:r>
-    </w:p>
-    <w:p>
-      <w:pPr>
-        <w:pStyle w:val="ListParagraph"/>
-        <w:numPr>
-          <w:ilvl w:val="0"/>
-          <w:numId w:val="2"/>
-        </w:numPr>
-        <w:spacing w:after="10" w:line="245"/>
-      </w:pPr>
-      <w:r>
-        <w:rPr>
-          <w:rFonts w:ascii="Times New Roman" w:cs="Times New Roman" w:eastAsia="Times New Roman" w:hAnsi="Times New Roman"/>
-          <w:color w:val="000000"/>
-          <w:sz w:val="21"/>
-          <w:szCs w:val="21"/>
-        </w:rPr>
-        <w:t xml:space="preserve">Built sales enablement (pitch openers, objection handling, answer cards) and aligned positioning with leadership and the data science team.</w:t>
+        <w:t xml:space="preserve">Lead Axsona’s end-to-end market entry into the UAE and wider Middle East, from ICP and segment prioritisation to positioning, partner model and pipeline targets.</w:t>
+      </w:r>
+    </w:p>
+    <w:p>
+      <w:pPr>
+        <w:pStyle w:val="ListParagraph"/>
+        <w:numPr>
+          <w:ilvl w:val="0"/>
+          <w:numId w:val="2"/>
+        </w:numPr>
+        <w:spacing w:after="10" w:line="245"/>
+      </w:pPr>
+      <w:r>
+        <w:rPr>
+          <w:rFonts w:ascii="Times New Roman" w:cs="Times New Roman" w:eastAsia="Times New Roman" w:hAnsi="Times New Roman"/>
+          <w:color w:val="000000"/>
+          <w:sz w:val="21"/>
+          <w:szCs w:val="21"/>
+        </w:rPr>
+        <w:t xml:space="preserve">Building an AI-automated GTM engine (account research, lead enrichment, personalised multi-channel outreach and CRM updates) so a lean team can run outbound across several segments at once.</w:t>
+      </w:r>
+    </w:p>
+    <w:p>
+      <w:pPr>
+        <w:pStyle w:val="ListParagraph"/>
+        <w:numPr>
+          <w:ilvl w:val="0"/>
+          <w:numId w:val="2"/>
+        </w:numPr>
+        <w:spacing w:after="10" w:line="245"/>
+      </w:pPr>
+      <w:r>
+        <w:rPr>
+          <w:rFonts w:ascii="Times New Roman" w:cs="Times New Roman" w:eastAsia="Times New Roman" w:hAnsi="Times New Roman"/>
+          <w:color w:val="000000"/>
+          <w:sz w:val="21"/>
+          <w:szCs w:val="21"/>
+        </w:rPr>
+        <w:t xml:space="preserve">Developing a two-track route to market: direct enterprise sales into banking, telecom, fintech, retail and real estate, plus a partner channel of agencies, consultancies and AI implementers.</w:t>
+      </w:r>
+    </w:p>
+    <w:p>
+      <w:pPr>
+        <w:pStyle w:val="ListParagraph"/>
+        <w:numPr>
+          <w:ilvl w:val="0"/>
+          <w:numId w:val="2"/>
+        </w:numPr>
+        <w:spacing w:after="10" w:line="245"/>
+      </w:pPr>
+      <w:r>
+        <w:rPr>
+          <w:rFonts w:ascii="Times New Roman" w:cs="Times New Roman" w:eastAsia="Times New Roman" w:hAnsi="Times New Roman"/>
+          <w:color w:val="000000"/>
+          <w:sz w:val="21"/>
+          <w:szCs w:val="21"/>
+        </w:rPr>
+        <w:t xml:space="preserve">Turning buyer conversations and regional industry events into account-specific proposals, sales collateral and team enablement.</w:t>
+      </w:r>
+    </w:p>
+    <w:p>
+      <w:pPr>
+        <w:pStyle w:val="ListParagraph"/>
+        <w:numPr>
+          <w:ilvl w:val="0"/>
+          <w:numId w:val="2"/>
+        </w:numPr>
+        <w:spacing w:after="10" w:line="245"/>
+      </w:pPr>
+      <w:r>
+        <w:rPr>
+          <w:rFonts w:ascii="Times New Roman" w:cs="Times New Roman" w:eastAsia="Times New Roman" w:hAnsi="Times New Roman"/>
+          <w:color w:val="000000"/>
+          <w:sz w:val="21"/>
+          <w:szCs w:val="21"/>
+        </w:rPr>
+        <w:t xml:space="preserve">Setting up the regional sales operating rhythm (pipeline stages, weekly activity targets, leadership reporting) to move from first pilots to repeatable revenue.</w:t>
       </w:r>
     </w:p>
     <w:p>
@@ -854,16 +854,16 @@
           <w:sz w:val="21"/>
           <w:szCs w:val="21"/>
         </w:rPr>
-        <w:t xml:space="preserve">AI &amp; Automation: </w:t>
-      </w:r>
-      <w:r>
-        <w:rPr>
-          <w:rFonts w:ascii="Times New Roman" w:cs="Times New Roman" w:eastAsia="Times New Roman" w:hAnsi="Times New Roman"/>
-          <w:color w:val="000000"/>
-          <w:sz w:val="21"/>
-          <w:szCs w:val="21"/>
-        </w:rPr>
-        <w:t xml:space="preserve">AI agents, generative AI (Claude, Gemini), synthetic audience testing, sales process automation, Slack and Jira integrations</w:t>
+        <w:t xml:space="preserve">AI &amp; GTM Engineering: </w:t>
+      </w:r>
+      <w:r>
+        <w:rPr>
+          <w:rFonts w:ascii="Times New Roman" w:cs="Times New Roman" w:eastAsia="Times New Roman" w:hAnsi="Times New Roman"/>
+          <w:color w:val="000000"/>
+          <w:sz w:val="21"/>
+          <w:szCs w:val="21"/>
+        </w:rPr>
+        <w:t xml:space="preserve">GTM engineering, outbound and sales process automation, lead enrichment, AI agents, generative AI (Claude, Gemini), Slack and Jira integrations</w:t>
       </w:r>
     </w:p>
     <w:p>

</xml_diff>

<commit_message>
Split CV into GTM Engineer and BD/Sales versions; add UAE details
- New GTM Engineer CV with a Selected Builds section and AI/API tooling
- BD/Sales CV replaces the single Modern version
- Phone, own-visa and driving-licence details in the contact block
- BackwardsLA account value; Pantas programmes spelt out (GVC, GHB)

Co-Authored-By: Claude Opus 5.5 <noreply@anthropic.com>
Claude-Session: https://claude.ai/code/session_01JCrzMJoLnbHnn3YThRBUsm
</commit_message>
<xml_diff>
--- a/Kasib/Kasib_Cassim_CV_Harvard.docx
+++ b/Kasib/Kasib_Cassim_CV_Harvard.docx
@@ -42,7 +42,7 @@
         </w:rPr>
         <w:t xml:space="preserve">  •  </w:t>
       </w:r>
-      <w:hyperlink w:history="1" r:id="rIdxjaw9cwf7y93dlcb7xfsy">
+      <w:hyperlink w:history="1" r:id="rIdw-men-o9nmwwymst3rd0y">
         <w:r>
           <w:rPr>
             <w:rFonts w:ascii="Times New Roman" w:cs="Times New Roman" w:eastAsia="Times New Roman" w:hAnsi="Times New Roman"/>
@@ -71,7 +71,7 @@
           <w:highlight w:val="yellow"/>
           <w:highlightCs w:val="yellow"/>
         </w:rPr>
-        <w:t xml:space="preserve">+971 XX XXX XXXX</w:t>
+        <w:t xml:space="preserve">+971 56 406 165</w:t>
       </w:r>
     </w:p>
     <w:p>
@@ -79,7 +79,7 @@
         <w:spacing w:after="40"/>
         <w:jc w:val="center"/>
       </w:pPr>
-      <w:hyperlink w:history="1" r:id="rIdoodsgfp2354khexmsno_f">
+      <w:hyperlink w:history="1" r:id="rIdyj4oleqtztb6h081vdtmm">
         <w:r>
           <w:rPr>
             <w:rFonts w:ascii="Times New Roman" w:cs="Times New Roman" w:eastAsia="Times New Roman" w:hAnsi="Times New Roman"/>
@@ -90,6 +90,42 @@
           <w:t xml:space="preserve">linkedin.com/in/mohamed-kasib-farhan-cassim-7b2a4222b</w:t>
         </w:r>
       </w:hyperlink>
+      <w:r>
+        <w:rPr>
+          <w:rFonts w:ascii="Times New Roman" w:cs="Times New Roman" w:eastAsia="Times New Roman" w:hAnsi="Times New Roman"/>
+          <w:color w:val="000000"/>
+          <w:sz w:val="21"/>
+          <w:szCs w:val="21"/>
+        </w:rPr>
+        <w:t xml:space="preserve">  •  </w:t>
+      </w:r>
+      <w:r>
+        <w:rPr>
+          <w:rFonts w:ascii="Times New Roman" w:cs="Times New Roman" w:eastAsia="Times New Roman" w:hAnsi="Times New Roman"/>
+          <w:color w:val="000000"/>
+          <w:sz w:val="21"/>
+          <w:szCs w:val="21"/>
+        </w:rPr>
+        <w:t xml:space="preserve">Own visa (no sponsorship needed)</w:t>
+      </w:r>
+      <w:r>
+        <w:rPr>
+          <w:rFonts w:ascii="Times New Roman" w:cs="Times New Roman" w:eastAsia="Times New Roman" w:hAnsi="Times New Roman"/>
+          <w:color w:val="000000"/>
+          <w:sz w:val="21"/>
+          <w:szCs w:val="21"/>
+        </w:rPr>
+        <w:t xml:space="preserve">  •  </w:t>
+      </w:r>
+      <w:r>
+        <w:rPr>
+          <w:rFonts w:ascii="Times New Roman" w:cs="Times New Roman" w:eastAsia="Times New Roman" w:hAnsi="Times New Roman"/>
+          <w:color w:val="000000"/>
+          <w:sz w:val="21"/>
+          <w:szCs w:val="21"/>
+        </w:rPr>
+        <w:t xml:space="preserve">Driving licence</w:t>
+      </w:r>
     </w:p>
     <w:p>
       <w:pPr>
@@ -514,7 +550,7 @@
           <w:sz w:val="21"/>
           <w:szCs w:val="21"/>
         </w:rPr>
-        <w:t xml:space="preserve">Owned the full sales cycle, building a MYR 6.2M+ (≈ USD 1.4M) qualified pipeline from 100+ high-profile enterprise accounts, from cold outreach to close.</w:t>
+        <w:t xml:space="preserve">Owned the full B2B SaaS sales cycle, building a MYR 6.2M+ (≈ USD 1.4M) qualified pipeline from 100+ high-profile enterprise accounts, from cold outreach to close.</w:t>
       </w:r>
     </w:p>
     <w:p>
@@ -552,45 +588,26 @@
           <w:sz w:val="21"/>
           <w:szCs w:val="21"/>
         </w:rPr>
-        <w:t xml:space="preserve">Automated the sales process with AI from prospecting to close; personally built an internal billing system and an AI help-desk agent (Slack + Jira).</w:t>
-      </w:r>
-    </w:p>
-    <w:p>
-      <w:pPr>
-        <w:pStyle w:val="ListParagraph"/>
-        <w:numPr>
-          <w:ilvl w:val="0"/>
-          <w:numId w:val="2"/>
-        </w:numPr>
-        <w:spacing w:after="10" w:line="245"/>
-      </w:pPr>
-      <w:r>
-        <w:rPr>
-          <w:rFonts w:ascii="Times New Roman" w:cs="Times New Roman" w:eastAsia="Times New Roman" w:hAnsi="Times New Roman"/>
-          <w:color w:val="000000"/>
-          <w:sz w:val="21"/>
-          <w:szCs w:val="21"/>
-        </w:rPr>
-        <w:t xml:space="preserve">Drove sustainability enablement for 800+ SMEs, building greener value chains with the SFIA, GHB and GVC programmes.</w:t>
-      </w:r>
-    </w:p>
-    <w:p>
-      <w:pPr>
-        <w:pStyle w:val="ListParagraph"/>
-        <w:numPr>
-          <w:ilvl w:val="0"/>
-          <w:numId w:val="2"/>
-        </w:numPr>
-        <w:spacing w:after="10" w:line="245"/>
-      </w:pPr>
-      <w:r>
-        <w:rPr>
-          <w:rFonts w:ascii="Times New Roman" w:cs="Times New Roman" w:eastAsia="Times New Roman" w:hAnsi="Times New Roman"/>
-          <w:color w:val="000000"/>
-          <w:sz w:val="21"/>
-          <w:szCs w:val="21"/>
-        </w:rPr>
-        <w:t xml:space="preserve">Shaped go-to-market strategy through strategic partnerships and outbound campaigns, opening new channels and high-value accounts.</w:t>
+        <w:t xml:space="preserve">Automated the sales process with AI from prospecting to close; built an internal billing system and an AI help-desk agent (Slack + Jira) with Claude Code and APIs.</w:t>
+      </w:r>
+    </w:p>
+    <w:p>
+      <w:pPr>
+        <w:pStyle w:val="ListParagraph"/>
+        <w:numPr>
+          <w:ilvl w:val="0"/>
+          <w:numId w:val="2"/>
+        </w:numPr>
+        <w:spacing w:after="10" w:line="245"/>
+      </w:pPr>
+      <w:r>
+        <w:rPr>
+          <w:rFonts w:ascii="Times New Roman" w:cs="Times New Roman" w:eastAsia="Times New Roman" w:hAnsi="Times New Roman"/>
+          <w:color w:val="000000"/>
+          <w:sz w:val="21"/>
+          <w:szCs w:val="21"/>
+        </w:rPr>
+        <w:t xml:space="preserve">Drove sustainability enablement for 800+ SMEs through central-bank and multilateral programmes, including Bank Negara Malaysia’s Greening Value Chain (GVC) and Greening Halal Business (GHB).</w:t>
       </w:r>
     </w:p>
     <w:p>
@@ -667,7 +684,7 @@
           <w:sz w:val="21"/>
           <w:szCs w:val="21"/>
         </w:rPr>
-        <w:t xml:space="preserve">Led client acquisition and business development, including high-impact pitches across key verticals.</w:t>
+        <w:t xml:space="preserve">Managed client accounts worth USD 5,000+, joined client pitches and supported deals through to close.</w:t>
       </w:r>
     </w:p>
     <w:p>
@@ -772,7 +789,7 @@
           <w:sz w:val="21"/>
           <w:szCs w:val="21"/>
         </w:rPr>
-        <w:t xml:space="preserve">Qualified and delivered high-quality leads to the sales team, consistently exceeding performance targets.</w:t>
+        <w:t xml:space="preserve">Sourced, qualified and handed over leads to the sales team, exceeding performance targets.</w:t>
       </w:r>
     </w:p>
     <w:p>
@@ -829,16 +846,16 @@
           <w:sz w:val="21"/>
           <w:szCs w:val="21"/>
         </w:rPr>
-        <w:t xml:space="preserve">Go-to-Market &amp; Sales: </w:t>
-      </w:r>
-      <w:r>
-        <w:rPr>
-          <w:rFonts w:ascii="Times New Roman" w:cs="Times New Roman" w:eastAsia="Times New Roman" w:hAnsi="Times New Roman"/>
-          <w:color w:val="000000"/>
-          <w:sz w:val="21"/>
-          <w:szCs w:val="21"/>
-        </w:rPr>
-        <w:t xml:space="preserve">GTM strategy, market entry, B2B enterprise sales, full-cycle sales, pipeline generation, account research, product demos, RFP/RFQ, proposals, strategic and channel partnerships, sales enablement, CRM</w:t>
+        <w:t xml:space="preserve">Sales &amp; Business Development: </w:t>
+      </w:r>
+      <w:r>
+        <w:rPr>
+          <w:rFonts w:ascii="Times New Roman" w:cs="Times New Roman" w:eastAsia="Times New Roman" w:hAnsi="Times New Roman"/>
+          <w:color w:val="000000"/>
+          <w:sz w:val="21"/>
+          <w:szCs w:val="21"/>
+        </w:rPr>
+        <w:t xml:space="preserve">B2B enterprise sales, full-cycle sales, prospecting, discovery, pipeline generation, product demos, RFP/RFQ, proposals, account management, strategic and channel partnerships, market entry, GTM strategy</w:t>
       </w:r>
     </w:p>
     <w:p>
@@ -854,16 +871,16 @@
           <w:sz w:val="21"/>
           <w:szCs w:val="21"/>
         </w:rPr>
-        <w:t xml:space="preserve">AI &amp; GTM Engineering: </w:t>
-      </w:r>
-      <w:r>
-        <w:rPr>
-          <w:rFonts w:ascii="Times New Roman" w:cs="Times New Roman" w:eastAsia="Times New Roman" w:hAnsi="Times New Roman"/>
-          <w:color w:val="000000"/>
-          <w:sz w:val="21"/>
-          <w:szCs w:val="21"/>
-        </w:rPr>
-        <w:t xml:space="preserve">GTM engineering, outbound and sales process automation, lead enrichment, AI agents, generative AI (Claude, Gemini), Slack and Jira integrations</w:t>
+        <w:t xml:space="preserve">AI &amp; Tools: </w:t>
+      </w:r>
+      <w:r>
+        <w:rPr>
+          <w:rFonts w:ascii="Times New Roman" w:cs="Times New Roman" w:eastAsia="Times New Roman" w:hAnsi="Times New Roman"/>
+          <w:color w:val="000000"/>
+          <w:sz w:val="21"/>
+          <w:szCs w:val="21"/>
+        </w:rPr>
+        <w:t xml:space="preserve">Claude Code, Claude and Gemini APIs, AI agents, sales automation, CRM, Slack, Jira, Google Workspace</w:t>
       </w:r>
     </w:p>
     <w:p>

</xml_diff>